<commit_message>
fix: Correct reference hanging indent and update author email
Use XML-level w:ind element with w:hanging attribute for reliable APA
hanging indent in references. Update email to hfy5138@psu.edu across
all manuscript files and conversion script.

Co-Authored-By: Claude Opus 4.6 <noreply@anthropic.com>
</commit_message>
<xml_diff>
--- a/manuscript/versions/Paper_B_AI_Coding_Methodology_v1.0.docx
+++ b/manuscript/versions/Paper_B_AI_Coding_Methodology_v1.0.docx
@@ -101,7 +101,7 @@
           <w:i w:val="0"/>
           <w:sz w:val="24"/>
         </w:rPr>
-        <w:t>Correspondence concerning this article should be addressed to Hosung You, College of Education, Pennsylvania State University, University Park, PA 16802. Email: hosung@psu.edu</w:t>
+        <w:t>Correspondence concerning this article should be addressed to Hosung You, College of Education, Pennsylvania State University, University Park, PA 16802. Email: hfy5138@psu.edu</w:t>
       </w:r>
     </w:p>
     <w:p>
@@ -7799,8 +7799,8 @@
     <w:p>
       <w:pPr>
         <w:spacing w:line="480" w:lineRule="auto" w:before="0" w:after="0"/>
-        <w:ind w:hanging="720" w:left="720"/>
         <w:jc w:val="left"/>
+        <w:ind w:left="720" w:hanging="720"/>
       </w:pPr>
       <w:r>
         <w:rPr>

</xml_diff>